<commit_message>
Add Show Project Summary toggle to Settings tab
</commit_message>
<xml_diff>
--- a/WSR Automation - User Guide.docx
+++ b/WSR Automation - User Guide.docx
@@ -29,15 +29,7 @@
     </w:p>
     <w:p>
       <w:r>
-        <w:t xml:space="preserve">Every Friday at 7:00 PM, a script automatically builds your Weekly Status Report email and either saves it as a draft in Outlook for you to review and </w:t>
-      </w:r>
-      <w:proofErr w:type="gramStart"/>
-      <w:r>
-        <w:t>send, or</w:t>
-      </w:r>
-      <w:proofErr w:type="gramEnd"/>
-      <w:r>
-        <w:t xml:space="preserve"> sends it automatically -- based on a setting you control. The content (project summaries, day-by-day tasks, dates) is pulled from a single Excel file that you keep updated during the week. You never have to manually build the report or copy-paste into an email.</w:t>
+        <w:t>Every Friday at 7:00 PM, a script automatically builds your Weekly Status Report email and either saves it as a draft in Outlook for you to review and send, or sends it automatically -- based on a setting you control. The content (project summaries, day-by-day tasks, dates) is pulled from a single Excel file that you keep updated during the week. You never have to manually build the report or copy-paste into an email.</w:t>
       </w:r>
     </w:p>
     <w:p>
@@ -95,7 +87,8 @@
         <w:pStyle w:val="ListBullet"/>
       </w:pPr>
       <w:r>
-        <w:t>Settings -- A single 'Auto Send (Yes/No)' cell. Set to 'Yes' before a run to have that week's report sent automatically; leave as 'No' (the safe default) to just get a draft to review and send yourself.</w:t>
+        <w:lastRenderedPageBreak/>
+        <w:t>Settings -- 'Auto Send (Yes/No)': set to 'Yes' before a run to have that week's report sent automatically; leave as 'No' (the safe default) to just get a draft to review and send yourself. 'Show Project Summary (Yes/No)': set to 'No' to hide the narrative Project Summary section from the email entirely, leaving just the Project Details and Effort Details tables; defaults to 'Yes'.</w:t>
       </w:r>
     </w:p>
     <w:p>
@@ -103,13 +96,212 @@
         <w:pStyle w:val="Heading2"/>
       </w:pPr>
       <w:r>
+        <w:t>Send-WeeklyStatusReport.ps1 (the automation script)</w:t>
+      </w:r>
+    </w:p>
+    <w:p>
+      <w:r>
+        <w:t>Located in the WSR\Scripts folder. This is the script that reads the Excel file and builds the email. It is fully generic -- identical for every user -- since all personal details (name, employee ID, supervisor, recipients, subject) live in the Excel file's 'My Info' tab instead of in the script. Each team member who wants their own automated report just needs their own copy of this script plus their own Excel file (see Section 6).</w:t>
+      </w:r>
+    </w:p>
+    <w:p>
+      <w:pPr>
+        <w:pStyle w:val="Heading2"/>
+      </w:pPr>
+      <w:r>
+        <w:t>Scheduled Task: WeeklyStatusReport</w:t>
+      </w:r>
+    </w:p>
+    <w:p>
+      <w:r>
+        <w:t>A Windows Task Scheduler entry that automatically runs the script every Friday at 7:00 PM under your Windows login.</w:t>
+      </w:r>
+    </w:p>
+    <w:p>
+      <w:pPr>
+        <w:pStyle w:val="Heading1"/>
+      </w:pPr>
+      <w:r>
+        <w:t>3. Your Weekly Workflow</w:t>
+      </w:r>
+    </w:p>
+    <w:p>
+      <w:pPr>
+        <w:pStyle w:val="ListNumber"/>
+      </w:pPr>
+      <w:r>
+        <w:t>During the week, open WeeklyEffortInput.xlsx and fill in the Project Summary tab -- one row per project, with a short paragraph describing what you worked on.</w:t>
+      </w:r>
+    </w:p>
+    <w:p>
+      <w:pPr>
+        <w:pStyle w:val="ListNumber"/>
+      </w:pPr>
+      <w:r>
+        <w:t>Fill in the Effort Details tab -- one row per project per weekday, plus the Internal standup row for each day. The Project value must exactly match a name from the Project Summary tab (or be 'Internal').</w:t>
+      </w:r>
+    </w:p>
+    <w:p>
+      <w:pPr>
+        <w:pStyle w:val="ListNumber"/>
+      </w:pPr>
+      <w:r>
+        <w:t>Decide how you want this week's report handled: leave Settings tab 'Auto Send' as 'No' for a draft to review, or set it to 'Yes' to have it sent automatically.</w:t>
+      </w:r>
+    </w:p>
+    <w:p>
+      <w:pPr>
+        <w:pStyle w:val="ListNumber"/>
+      </w:pPr>
+      <w:r>
+        <w:t>Save the file (or just leave AutoSave on -- you don't need to manually save or close it before the scheduled run).</w:t>
+      </w:r>
+    </w:p>
+    <w:p>
+      <w:pPr>
+        <w:pStyle w:val="ListNumber"/>
+      </w:pPr>
+      <w:r>
+        <w:t>At 7:00 PM Friday, the report is generated automatically. If set to draft mode, open classic Outlook, review the draft, and click Send. If set to auto-send, it is sent immediately with no further action needed.</w:t>
+      </w:r>
+    </w:p>
+    <w:p>
+      <w:pPr>
+        <w:pStyle w:val="Heading1"/>
+      </w:pPr>
+      <w:r>
+        <w:t>4. What the Generated Email Looks Like</w:t>
+      </w:r>
+    </w:p>
+    <w:p>
+      <w:r>
+        <w:t>The email is built in this order:</w:t>
+      </w:r>
+    </w:p>
+    <w:p>
+      <w:pPr>
+        <w:pStyle w:val="ListBullet"/>
+      </w:pPr>
+      <w:r>
+        <w:t>Greeting (e.g. 'Hi Pradeep and Team,') and an intro line stating the week's date range.</w:t>
+      </w:r>
+    </w:p>
+    <w:p>
+      <w:pPr>
+        <w:pStyle w:val="ListBullet"/>
+      </w:pPr>
+      <w:r>
+        <w:t>Project Summary for This Week -- a paragraph per project, taken directly from the Project Summary tab.</w:t>
+      </w:r>
+    </w:p>
+    <w:p>
+      <w:pPr>
+        <w:pStyle w:val="ListBullet"/>
+      </w:pPr>
+      <w:r>
+        <w:t>Weekly Status Report / Project Details table -- Name, Project(s), Week Beginning, Supervisor, Report Date, Employee ID.</w:t>
+      </w:r>
+    </w:p>
+    <w:p>
+      <w:pPr>
+        <w:pStyle w:val="ListBullet"/>
+      </w:pPr>
+      <w:r>
         <w:lastRenderedPageBreak/>
-        <w:t>Send-WeeklyStatusReport.ps1 (the automation script)</w:t>
-      </w:r>
-    </w:p>
-    <w:p>
-      <w:r>
-        <w:t>Located in the WSR\Scripts folder. This is the script that reads the Excel file and builds the email. It is fully generic -- identical for every user -- since all personal details (name, employee ID, supervisor, recipients, subject) live in the Excel file's 'My Info' tab instead of in the script. Each team member who wants their own automated report just needs their own copy of this script plus their own Excel file (see Section 6).</w:t>
+        <w:t>Effort Details table -- day-by-day rows for each project plus the Internal standup row.</w:t>
+      </w:r>
+    </w:p>
+    <w:p>
+      <w:pPr>
+        <w:pStyle w:val="ListBullet"/>
+      </w:pPr>
+      <w:r>
+        <w:t>Closing line and your normal Outlook email signature.</w:t>
+      </w:r>
+    </w:p>
+    <w:p>
+      <w:pPr>
+        <w:pStyle w:val="Heading1"/>
+      </w:pPr>
+      <w:r>
+        <w:t>5. What's Required for the Automatic Run</w:t>
+      </w:r>
+    </w:p>
+    <w:p>
+      <w:pPr>
+        <w:pStyle w:val="ListBullet"/>
+      </w:pPr>
+      <w:r>
+        <w:t>Your computer must be powered on (not shut down, sleeping, or hibernating) at the scheduled time.</w:t>
+      </w:r>
+    </w:p>
+    <w:p>
+      <w:pPr>
+        <w:pStyle w:val="ListBullet"/>
+      </w:pPr>
+      <w:r>
+        <w:t>You must be logged in to Windows (the screen can be locked, that's fine).</w:t>
+      </w:r>
+    </w:p>
+    <w:p>
+      <w:pPr>
+        <w:pStyle w:val="ListBullet"/>
+      </w:pPr>
+      <w:r>
+        <w:t>Outlook does not need to already be open -- the script starts it automatically.</w:t>
+      </w:r>
+    </w:p>
+    <w:p>
+      <w:pPr>
+        <w:pStyle w:val="ListBullet"/>
+      </w:pPr>
+      <w:r>
+        <w:t>Excel does not need to be open either -- you can close WeeklyEffortInput.xlsx (or leave it open, both work) before the trigger time; the script opens it in the background just to read the data.</w:t>
+      </w:r>
+    </w:p>
+    <w:p>
+      <w:pPr>
+        <w:pStyle w:val="ListBullet"/>
+      </w:pPr>
+      <w:r>
+        <w:t>It's also fine if Outlook, Excel, or this guide document (Word) are already open when the trigger fires -- the script simply works alongside them without closing, restarting, or interrupting anything you have open.</w:t>
+      </w:r>
+    </w:p>
+    <w:p>
+      <w:pPr>
+        <w:pStyle w:val="ListBullet"/>
+      </w:pPr>
+      <w:r>
+        <w:t>Logged in at 7:00 PM Friday: the task runs exactly on schedule, as normal.</w:t>
+      </w:r>
+    </w:p>
+    <w:p>
+      <w:pPr>
+        <w:pStyle w:val="ListBullet"/>
+      </w:pPr>
+      <w:r>
+        <w:t>Logged off before 7:00 PM Friday: the 7:00 PM trigger is missed (not queued for later that same time). Instead, the task is configured to catch up automatically the next time you log back in -- whether that's later that evening, over the weekend, or Monday morning -- rather than skipping that week entirely.</w:t>
+      </w:r>
+    </w:p>
+    <w:p>
+      <w:pPr>
+        <w:pStyle w:val="ListBullet"/>
+      </w:pPr>
+      <w:r>
+        <w:t>Because of this, if you know you are logging off early on a Friday, it's worth double-checking WeeklyEffortInput.xlsx is finished beforehand -- the report will use whatever is saved in the file at the moment the task actually ends up running, which could be later than expected.</w:t>
+      </w:r>
+    </w:p>
+    <w:p>
+      <w:pPr>
+        <w:pStyle w:val="Heading1"/>
+      </w:pPr>
+      <w:r>
+        <w:t>6. Setting This Up for a Different Team Member</w:t>
+      </w:r>
+    </w:p>
+    <w:p>
+      <w:r>
+        <w:t>This automation is fully generic and shared across users: the script itself is identical for everyone, and all personal details (Name, Employee ID, Supervisor, Greeting, To/CC emails, Subject) live in the 'My Info' tab of each person's own Excel file. A teammate never needs to open or edit the PowerShell script -- they just need their own copy of the script, their own Excel file, and their own scheduled task. Follow the steps below to set this up for someone new.</w:t>
       </w:r>
     </w:p>
     <w:p>
@@ -117,267 +309,31 @@
         <w:pStyle w:val="Heading2"/>
       </w:pPr>
       <w:r>
-        <w:t xml:space="preserve">Scheduled Task: </w:t>
-      </w:r>
-      <w:proofErr w:type="spellStart"/>
-      <w:r>
-        <w:t>WeeklyStatusReport</w:t>
-      </w:r>
-      <w:proofErr w:type="spellEnd"/>
-    </w:p>
-    <w:p>
-      <w:r>
-        <w:t>A Windows Task Scheduler entry that automatically runs the script every Friday at 7:00 PM under your Windows login.</w:t>
-      </w:r>
-    </w:p>
-    <w:p>
-      <w:pPr>
-        <w:pStyle w:val="Heading1"/>
-      </w:pPr>
-      <w:r>
-        <w:t>3. Your Weekly Workflow</w:t>
-      </w:r>
-    </w:p>
-    <w:p>
-      <w:pPr>
-        <w:pStyle w:val="ListNumber"/>
-      </w:pPr>
-      <w:r>
-        <w:t>During the week, open WeeklyEffortInput.xlsx and fill in the Project Summary tab -- one row per project, with a short paragraph describing what you worked on.</w:t>
-      </w:r>
-    </w:p>
-    <w:p>
-      <w:pPr>
-        <w:pStyle w:val="ListNumber"/>
-      </w:pPr>
-      <w:r>
-        <w:t>Fill in the Effort Details tab -- one row per project per weekday, plus the Internal standup row for each day. The Project value must exactly match a name from the Project Summary tab (or be 'Internal').</w:t>
-      </w:r>
-    </w:p>
-    <w:p>
-      <w:pPr>
-        <w:pStyle w:val="ListNumber"/>
-      </w:pPr>
-      <w:r>
-        <w:t xml:space="preserve">Decide how you want this week's report handled: leave Settings tab 'Auto Send' as 'No' for a draft to </w:t>
-      </w:r>
-      <w:proofErr w:type="gramStart"/>
-      <w:r>
-        <w:t>review, or</w:t>
-      </w:r>
-      <w:proofErr w:type="gramEnd"/>
-      <w:r>
-        <w:t xml:space="preserve"> set it to 'Yes' to have it sent automatically.</w:t>
-      </w:r>
-    </w:p>
-    <w:p>
-      <w:pPr>
-        <w:pStyle w:val="ListNumber"/>
-      </w:pPr>
-      <w:r>
-        <w:t>Save the file (or just leave AutoSave on -- you don't need to manually save or close it before the scheduled run).</w:t>
-      </w:r>
-    </w:p>
-    <w:p>
-      <w:pPr>
-        <w:pStyle w:val="ListNumber"/>
-      </w:pPr>
-      <w:r>
-        <w:t>At 7:00 PM Friday, the report is generated automatically. If set to draft mode, open classic Outlook, review the draft, and click Send. If set to auto-send, it is sent immediately with no further action needed.</w:t>
-      </w:r>
-    </w:p>
-    <w:p>
-      <w:pPr>
-        <w:pStyle w:val="Heading1"/>
-      </w:pPr>
-      <w:r>
-        <w:t>4. What the Generated Email Looks Like</w:t>
-      </w:r>
-    </w:p>
-    <w:p>
-      <w:r>
-        <w:t>The email is built in this order:</w:t>
-      </w:r>
-    </w:p>
-    <w:p>
-      <w:pPr>
-        <w:pStyle w:val="ListBullet"/>
-      </w:pPr>
-      <w:r>
-        <w:t>Greeting (e.g. 'Hi Pradeep and Team,') and an intro line stating the week's date range.</w:t>
-      </w:r>
-    </w:p>
-    <w:p>
-      <w:pPr>
-        <w:pStyle w:val="ListBullet"/>
-      </w:pPr>
-      <w:r>
-        <w:t>Project Summary for This Week -- a paragraph per project, taken directly from the Project Summary tab.</w:t>
-      </w:r>
-    </w:p>
-    <w:p>
-      <w:pPr>
-        <w:pStyle w:val="ListBullet"/>
-      </w:pPr>
-      <w:r>
-        <w:t>Weekly Status Report / Project Details table -- Name, Project(s), Week Beginning, Supervisor, Report Date, Employee ID.</w:t>
-      </w:r>
-    </w:p>
-    <w:p>
-      <w:pPr>
-        <w:pStyle w:val="ListBullet"/>
-      </w:pPr>
-      <w:r>
-        <w:t>Effort Details table -- day-by-day rows for each project plus the Internal standup row.</w:t>
-      </w:r>
-    </w:p>
-    <w:p>
-      <w:pPr>
-        <w:pStyle w:val="ListBullet"/>
-      </w:pPr>
-      <w:r>
-        <w:t>Closing line and your normal Outlook email signature.</w:t>
-      </w:r>
-    </w:p>
-    <w:p>
-      <w:pPr>
-        <w:pStyle w:val="Heading1"/>
+        <w:t>What to Share With a Teammate</w:t>
+      </w:r>
+    </w:p>
+    <w:p>
+      <w:pPr>
+        <w:pStyle w:val="ListBullet"/>
+      </w:pPr>
+      <w:r>
+        <w:t>Setup-NewUser.ps1 and Send-WeeklyStatusReport.ps1 -- keep both files together in the same folder (e.g. zip them together) when sharing.</w:t>
+      </w:r>
+    </w:p>
+    <w:p>
+      <w:pPr>
+        <w:pStyle w:val="ListBullet"/>
+      </w:pPr>
+      <w:r>
+        <w:t>This user guide document.</w:t>
+      </w:r>
+    </w:p>
+    <w:p>
+      <w:pPr>
+        <w:pStyle w:val="Heading2"/>
       </w:pPr>
       <w:r>
         <w:lastRenderedPageBreak/>
-        <w:t>5. What's Required for the Automatic Run</w:t>
-      </w:r>
-    </w:p>
-    <w:p>
-      <w:pPr>
-        <w:pStyle w:val="ListBullet"/>
-      </w:pPr>
-      <w:r>
-        <w:t>Your computer must be powered on (not shut down, sleeping, or hibernating) at the scheduled time.</w:t>
-      </w:r>
-    </w:p>
-    <w:p>
-      <w:pPr>
-        <w:pStyle w:val="ListBullet"/>
-      </w:pPr>
-      <w:r>
-        <w:t>You must be logged in to Windows (the screen can be locked, that's fine).</w:t>
-      </w:r>
-    </w:p>
-    <w:p>
-      <w:pPr>
-        <w:pStyle w:val="ListBullet"/>
-      </w:pPr>
-      <w:r>
-        <w:t>Outlook does not need to already be open -- the script starts it automatically.</w:t>
-      </w:r>
-    </w:p>
-    <w:p>
-      <w:pPr>
-        <w:pStyle w:val="ListBullet"/>
-      </w:pPr>
-      <w:r>
-        <w:t>Excel does not need to be open either -- you can close WeeklyEffortInput.xlsx (or leave it open, both work) before the trigger time; the script opens it in the background just to read the data.</w:t>
-      </w:r>
-    </w:p>
-    <w:p>
-      <w:pPr>
-        <w:pStyle w:val="ListBullet"/>
-      </w:pPr>
-      <w:r>
-        <w:t>It's also fine if Outlook, Excel, or this guide document (Word) are already open when the trigger fires -- the script simply works alongside them without closing, restarting, or interrupting anything you have open.</w:t>
-      </w:r>
-    </w:p>
-    <w:p>
-      <w:pPr>
-        <w:pStyle w:val="ListBullet"/>
-      </w:pPr>
-      <w:r>
-        <w:t>Logged in at 7:00 PM Friday: the task runs exactly on schedule, as normal.</w:t>
-      </w:r>
-    </w:p>
-    <w:p>
-      <w:pPr>
-        <w:pStyle w:val="ListBullet"/>
-      </w:pPr>
-      <w:r>
-        <w:t>Logged off before 7:00 PM Friday: the 7:00 PM trigger is missed (not queued for later that same time). Instead, the task is configured to catch up automatically the next time you log back in -- whether that's later that evening, over the weekend, or Monday morning -- rather than skipping that week entirely.</w:t>
-      </w:r>
-    </w:p>
-    <w:p>
-      <w:pPr>
-        <w:pStyle w:val="ListBullet"/>
-      </w:pPr>
-      <w:r>
-        <w:t xml:space="preserve">Because of this, if you know you are logging off early on a Friday, it's worth double-checking WeeklyEffortInput.xlsx is finished beforehand -- the report will use whatever is saved in the file </w:t>
-      </w:r>
-      <w:proofErr w:type="gramStart"/>
-      <w:r>
-        <w:t>at the moment</w:t>
-      </w:r>
-      <w:proofErr w:type="gramEnd"/>
-      <w:r>
-        <w:t xml:space="preserve"> the task </w:t>
-      </w:r>
-      <w:proofErr w:type="gramStart"/>
-      <w:r>
-        <w:t>actually ends</w:t>
-      </w:r>
-      <w:proofErr w:type="gramEnd"/>
-      <w:r>
-        <w:t xml:space="preserve"> up running, which could be later than expected.</w:t>
-      </w:r>
-    </w:p>
-    <w:p>
-      <w:pPr>
-        <w:pStyle w:val="Heading1"/>
-      </w:pPr>
-      <w:r>
-        <w:t>6. Setting This Up for a Different Team Member</w:t>
-      </w:r>
-    </w:p>
-    <w:p>
-      <w:r>
-        <w:t>This automation is fully generic and shared across users: the script itself is identical for everyone, and all personal details (Name, Employee ID, Supervisor, Greeting, To/CC emails, Subject) live in the 'My Info' tab of each person's own Excel file. A teammate never needs to open or edit the PowerShell script -- they just need their own copy of the script, their own Excel file, and their own scheduled task. Follow the steps below to set this up for someone new.</w:t>
-      </w:r>
-    </w:p>
-    <w:p>
-      <w:pPr>
-        <w:pStyle w:val="Heading2"/>
-      </w:pPr>
-      <w:r>
-        <w:t xml:space="preserve">What to Share </w:t>
-      </w:r>
-      <w:proofErr w:type="gramStart"/>
-      <w:r>
-        <w:t>With</w:t>
-      </w:r>
-      <w:proofErr w:type="gramEnd"/>
-      <w:r>
-        <w:t xml:space="preserve"> a Teammate</w:t>
-      </w:r>
-    </w:p>
-    <w:p>
-      <w:pPr>
-        <w:pStyle w:val="ListBullet"/>
-      </w:pPr>
-      <w:r>
-        <w:t>Setup-NewUser.ps1 and Send-WeeklyStatusReport.ps1 -- keep both files together in the same folder (e.g. zip them together) when sharing.</w:t>
-      </w:r>
-    </w:p>
-    <w:p>
-      <w:pPr>
-        <w:pStyle w:val="ListBullet"/>
-      </w:pPr>
-      <w:r>
-        <w:t>This user guide document.</w:t>
-      </w:r>
-    </w:p>
-    <w:p>
-      <w:pPr>
-        <w:pStyle w:val="Heading2"/>
-      </w:pPr>
-      <w:r>
         <w:t>Steps for Each Teammate to Follow</w:t>
       </w:r>
     </w:p>
@@ -405,54 +361,12 @@
           <w:sz w:val="19"/>
         </w:rPr>
       </w:pPr>
-      <w:proofErr w:type="spellStart"/>
       <w:r>
         <w:rPr>
           <w:rFonts w:ascii="Consolas" w:hAnsi="Consolas"/>
           <w:sz w:val="19"/>
         </w:rPr>
-        <w:lastRenderedPageBreak/>
-        <w:t>powershell</w:t>
-      </w:r>
-      <w:proofErr w:type="spellEnd"/>
-      <w:r>
-        <w:rPr>
-          <w:rFonts w:ascii="Consolas" w:hAnsi="Consolas"/>
-          <w:sz w:val="19"/>
-        </w:rPr>
-        <w:t xml:space="preserve"> -</w:t>
-      </w:r>
-      <w:proofErr w:type="spellStart"/>
-      <w:r>
-        <w:rPr>
-          <w:rFonts w:ascii="Consolas" w:hAnsi="Consolas"/>
-          <w:sz w:val="19"/>
-        </w:rPr>
-        <w:t>NoProfile</w:t>
-      </w:r>
-      <w:proofErr w:type="spellEnd"/>
-      <w:r>
-        <w:rPr>
-          <w:rFonts w:ascii="Consolas" w:hAnsi="Consolas"/>
-          <w:sz w:val="19"/>
-        </w:rPr>
-        <w:t xml:space="preserve"> -</w:t>
-      </w:r>
-      <w:proofErr w:type="spellStart"/>
-      <w:r>
-        <w:rPr>
-          <w:rFonts w:ascii="Consolas" w:hAnsi="Consolas"/>
-          <w:sz w:val="19"/>
-        </w:rPr>
-        <w:t>ExecutionPolicy</w:t>
-      </w:r>
-      <w:proofErr w:type="spellEnd"/>
-      <w:r>
-        <w:rPr>
-          <w:rFonts w:ascii="Consolas" w:hAnsi="Consolas"/>
-          <w:sz w:val="19"/>
-        </w:rPr>
-        <w:t xml:space="preserve"> Bypass -File "C:\path\to\Setup-NewUser.ps1"</w:t>
+        <w:t>powershell -NoProfile -ExecutionPolicy Bypass -File "C:\path\to\Setup-NewUser.ps1"</w:t>
       </w:r>
     </w:p>
     <w:p>
@@ -503,53 +417,12 @@
           <w:sz w:val="19"/>
         </w:rPr>
       </w:pPr>
-      <w:proofErr w:type="spellStart"/>
       <w:r>
         <w:rPr>
           <w:rFonts w:ascii="Consolas" w:hAnsi="Consolas"/>
           <w:sz w:val="19"/>
         </w:rPr>
-        <w:t>powershell</w:t>
-      </w:r>
-      <w:proofErr w:type="spellEnd"/>
-      <w:r>
-        <w:rPr>
-          <w:rFonts w:ascii="Consolas" w:hAnsi="Consolas"/>
-          <w:sz w:val="19"/>
-        </w:rPr>
-        <w:t xml:space="preserve"> -</w:t>
-      </w:r>
-      <w:proofErr w:type="spellStart"/>
-      <w:r>
-        <w:rPr>
-          <w:rFonts w:ascii="Consolas" w:hAnsi="Consolas"/>
-          <w:sz w:val="19"/>
-        </w:rPr>
-        <w:t>NoProfile</w:t>
-      </w:r>
-      <w:proofErr w:type="spellEnd"/>
-      <w:r>
-        <w:rPr>
-          <w:rFonts w:ascii="Consolas" w:hAnsi="Consolas"/>
-          <w:sz w:val="19"/>
-        </w:rPr>
-        <w:t xml:space="preserve"> -</w:t>
-      </w:r>
-      <w:proofErr w:type="spellStart"/>
-      <w:r>
-        <w:rPr>
-          <w:rFonts w:ascii="Consolas" w:hAnsi="Consolas"/>
-          <w:sz w:val="19"/>
-        </w:rPr>
-        <w:t>ExecutionPolicy</w:t>
-      </w:r>
-      <w:proofErr w:type="spellEnd"/>
-      <w:r>
-        <w:rPr>
-          <w:rFonts w:ascii="Consolas" w:hAnsi="Consolas"/>
-          <w:sz w:val="19"/>
-        </w:rPr>
-        <w:t xml:space="preserve"> Bypass -File "C:\path\to\WSR\Scripts\Send-WeeklyStatusReport.ps1"</w:t>
+        <w:t>powershell -NoProfile -ExecutionPolicy Bypass -File "C:\path\to\WSR\Scripts\Send-WeeklyStatusReport.ps1"</w:t>
       </w:r>
     </w:p>
     <w:p>
@@ -573,15 +446,7 @@
         <w:pStyle w:val="ListBullet"/>
       </w:pPr>
       <w:r>
-        <w:t xml:space="preserve">Comfort running one PowerShell command to </w:t>
-      </w:r>
-      <w:proofErr w:type="gramStart"/>
-      <w:r>
-        <w:t>install, or</w:t>
-      </w:r>
-      <w:proofErr w:type="gramEnd"/>
-      <w:r>
-        <w:t xml:space="preserve"> help from IT support (or your own Claude Code assistant, using this guide as reference).</w:t>
+        <w:t>Comfort running one PowerShell command to install, or help from IT support (or your own Claude Code assistant, using this guide as reference).</w:t>
       </w:r>
     </w:p>
     <w:p>
@@ -597,47 +462,23 @@
         <w:pStyle w:val="ListBullet"/>
       </w:pPr>
       <w:r>
-        <w:t xml:space="preserve">You can leave WeeklyEffortInput.xlsx open in Excel all the time with AutoSave on -- the script reads whatever is currently saved on disk when it </w:t>
-      </w:r>
-      <w:proofErr w:type="gramStart"/>
-      <w:r>
-        <w:t>runs, and</w:t>
-      </w:r>
-      <w:proofErr w:type="gramEnd"/>
-      <w:r>
-        <w:t xml:space="preserve"> does not interfere with your open window.</w:t>
-      </w:r>
-    </w:p>
-    <w:p>
-      <w:pPr>
-        <w:pStyle w:val="ListBullet"/>
-      </w:pPr>
-      <w:r>
-        <w:t xml:space="preserve">Real Outlook @mentions (the kind that trigger a notification) can only be added by manually typing '@' inside the draft yourself -- the script cannot create genuine mentions, only plain text or clickable </w:t>
-      </w:r>
-      <w:proofErr w:type="spellStart"/>
-      <w:r>
-        <w:t>mailto</w:t>
-      </w:r>
-      <w:proofErr w:type="spellEnd"/>
-      <w:r>
-        <w:t xml:space="preserve"> links.</w:t>
-      </w:r>
-    </w:p>
-    <w:p>
-      <w:pPr>
-        <w:pStyle w:val="ListBullet"/>
-      </w:pPr>
-      <w:r>
-        <w:t xml:space="preserve">Auto Send is off by default for safety. Only emails </w:t>
-      </w:r>
-      <w:proofErr w:type="gramStart"/>
-      <w:r>
-        <w:t>actually get</w:t>
-      </w:r>
-      <w:proofErr w:type="gramEnd"/>
-      <w:r>
-        <w:t xml:space="preserve"> sent automatically if you deliberately set the Settings tab to 'Yes' for that week.</w:t>
+        <w:t>You can leave WeeklyEffortInput.xlsx open in Excel all the time with AutoSave on -- the script reads whatever is currently saved on disk when it runs, and does not interfere with your open window.</w:t>
+      </w:r>
+    </w:p>
+    <w:p>
+      <w:pPr>
+        <w:pStyle w:val="ListBullet"/>
+      </w:pPr>
+      <w:r>
+        <w:t>Real Outlook @mentions (the kind that trigger a notification) can only be added by manually typing '@' inside the draft yourself -- the script cannot create genuine mentions, only plain text or clickable mailto links.</w:t>
+      </w:r>
+    </w:p>
+    <w:p>
+      <w:pPr>
+        <w:pStyle w:val="ListBullet"/>
+      </w:pPr>
+      <w:r>
+        <w:t>Auto Send is off by default for safety. Only emails actually get sent automatically if you deliberately set the Settings tab to 'Yes' for that week.</w:t>
       </w:r>
     </w:p>
     <w:p>
@@ -653,15 +494,7 @@
         <w:pStyle w:val="ListBullet"/>
       </w:pPr>
       <w:r>
-        <w:t xml:space="preserve">Because each week replies to the last one, the email will include quoted history from previous weeks below your new report -- this is normal thread </w:t>
-      </w:r>
-      <w:proofErr w:type="spellStart"/>
-      <w:r>
-        <w:t>behavior</w:t>
-      </w:r>
-      <w:proofErr w:type="spellEnd"/>
-      <w:r>
-        <w:t>, not a bug. Recipients will see the full history if they scroll down, and Outlook (or any email client) will group all weeks together as one conversation.</w:t>
+        <w:t>Because each week replies to the last one, the email will include quoted history from previous weeks below your new report -- this is normal thread behavior, not a bug. Recipients will see the full history if they scroll down, and Outlook (or any email client) will group all weeks together as one conversation.</w:t>
       </w:r>
     </w:p>
     <w:p>
@@ -669,7 +502,6 @@
         <w:pStyle w:val="Heading1"/>
       </w:pPr>
       <w:r>
-        <w:lastRenderedPageBreak/>
         <w:t>8. Troubleshooting</w:t>
       </w:r>
     </w:p>
@@ -678,15 +510,7 @@
         <w:pStyle w:val="ListBullet"/>
       </w:pPr>
       <w:r>
-        <w:t xml:space="preserve">Don't see the draft? Make sure you're checking classic Outlook (search Start menu for 'Outlook (classic)'), not the New Outlook app -- they use separate mailboxes/caches even though </w:t>
-      </w:r>
-      <w:proofErr w:type="gramStart"/>
-      <w:r>
-        <w:t>both sync</w:t>
-      </w:r>
-      <w:proofErr w:type="gramEnd"/>
-      <w:r>
-        <w:t xml:space="preserve"> to the same account.</w:t>
+        <w:t>Don't see the draft? Make sure you're checking classic Outlook (search Start menu for 'Outlook (classic)'), not the New Outlook app -- they use separate mailboxes/caches even though both sync to the same account.</w:t>
       </w:r>
     </w:p>
     <w:p>

</xml_diff>